<commit_message>
refactor: rename product BEFORE -> Time-Out
- brand-cased BEFORE -> Time-Out across site, docs, scripts, tests (62 sites)
- prose 'before' and the internal Python package name untouched
- Xano static host renamed: timeout-prod-74602b-...
- receipt DNS anchor re-registered on timeout-receipts-demo.com and verified
- GitHub repo renamed usv240/before -> usv240/time-out (old URL 301s)
- Doctavian DOCX, evidence PDF, Foxit source bundle rebuilt with new brand
- Xano API canonical stays 'before': CLI cannot rename a group and its
  queries in one push; cosmetic, /api:before/v1 remains live
</commit_message>
<xml_diff>
--- a/before/doctavian/tx-neurotoxin-consent-v1.docx
+++ b/before/doctavian/tx-neurotoxin-consent-v1.docx
@@ -541,7 +541,7 @@
         <w:color w:val="5F6B78"/>
         <w:sz w:val="16"/>
       </w:rPr>
-      <w:t>BEFORE • Treatment-party consent • Not a legality or safety certification</w:t>
+      <w:t>Time-Out • Treatment-party consent • Not a legality or safety certification</w:t>
     </w:r>
   </w:p>
 </w:ftr>
@@ -560,7 +560,7 @@
         <w:color w:val="0D767A"/>
         <w:sz w:val="18"/>
       </w:rPr>
-      <w:t>BEFORE  /  TEXAS NEUROTOXIN CONSENT</w:t>
+      <w:t>Time-Out  /  TEXAS NEUROTOXIN CONSENT</w:t>
     </w:r>
     <w:r>
       <w:rPr>

</xml_diff>